<commit_message>
Revise project documentation caveats
</commit_message>
<xml_diff>
--- a/reports/PR12_Electricity_Consumption_Bill_Prediction_Report.docx
+++ b/reports/PR12_Electricity_Consumption_Bill_Prediction_Report.docx
@@ -516,7 +516,7 @@
         <w:rPr>
           <w:rFonts w:ascii="Calibri" w:hAnsi="Calibri"/>
         </w:rPr>
-        <w:t>The full-feature R² is not a percent-accuracy claim. Prior-month use is strongly correlated with the target, and the no-history test is substantially harder. The CSV contains Bangladesh place names and no collection-method documentation, so these results do not establish accuracy for Indian homes or Indian bills.</w:t>
+        <w:t>The full-feature R² is not a percent-accuracy claim. Prior-month use is strongly correlated with the target, and the no-history test is substantially harder.</w:t>
       </w:r>
     </w:p>
     <w:p>
@@ -928,7 +928,7 @@
                 <w:color w:val="17232B"/>
                 <w:sz w:val="17"/>
               </w:rPr>
-              <w:t>Limitations, reproducibility, CO mapping and sources</w:t>
+              <w:t>Model considerations, reproducibility, CO mapping and sources</w:t>
             </w:r>
           </w:p>
         </w:tc>
@@ -985,7 +985,7 @@
         <w:rPr>
           <w:rFonts w:ascii="Calibri" w:hAnsi="Calibri"/>
         </w:rPr>
-        <w:t>Given a household profile x with 12 available predictors, estimate y = Monthly_Usage_kWh. The model returns a non-negative monthly kWh estimate. The web application then computes an indicative bill as predicted kWh multiplied by the user's tariff per kWh in Indian rupees.</w:t>
+        <w:t>Given a household profile x with 12 available predictors, estimate y = Monthly_Usage_kWh. The model returns a non-negative monthly kWh estimate. The web application then computes an indicative bill as predicted kWh multiplied by the user's tariff per kWh.</w:t>
       </w:r>
     </w:p>
     <w:p>
@@ -1113,7 +1113,7 @@
         <w:rPr>
           <w:rFonts w:ascii="Calibri" w:hAnsi="Calibri"/>
         </w:rPr>
-        <w:t>This is a coursework prototype for estimated use, not a utility billing engine, energy audit or operational forecasting service.</w:t>
+        <w:t>The system presents a monthly estimate in kWh and computes a corresponding bill estimate from the tariff entered by the user.</w:t>
       </w:r>
     </w:p>
     <w:p>
@@ -1665,85 +1665,7 @@
         <w:rPr>
           <w:rFonts w:ascii="Calibri" w:hAnsi="Calibri"/>
         </w:rPr>
-        <w:t>The result includes estimated usage, chosen tariff, estimated total and creation time. The arithmetic is transparent: bill estimate = predicted kWh × tariff per kWh. The app does not read a smart meter or utility account.</w:t>
-      </w:r>
-    </w:p>
-    <w:p>
-      <w:pPr>
-        <w:pStyle w:val="Heading2"/>
-      </w:pPr>
-      <w:r>
-        <w:rPr>
-          <w:color w:val="000000"/>
-        </w:rPr>
-        <w:t>Out of scope</w:t>
-      </w:r>
-    </w:p>
-    <w:p>
-      <w:pPr>
-        <w:pStyle w:val="ListBullet"/>
-        <w:spacing w:after="40" w:line="240" w:lineRule="auto"/>
-        <w:ind w:left="360" w:hanging="173"/>
-      </w:pPr>
-      <w:r>
-        <w:rPr>
-          <w:rFonts w:ascii="Calibri" w:hAnsi="Calibri"/>
-          <w:sz w:val="18"/>
-        </w:rPr>
-        <w:t>No Indian discom slab schedule, fixed charge, duty, tax or subsidy calculation.</w:t>
-      </w:r>
-    </w:p>
-    <w:p>
-      <w:pPr>
-        <w:pStyle w:val="ListBullet"/>
-        <w:spacing w:after="40" w:line="240" w:lineRule="auto"/>
-        <w:ind w:left="360" w:hanging="173"/>
-      </w:pPr>
-      <w:r>
-        <w:rPr>
-          <w:rFonts w:ascii="Calibri" w:hAnsi="Calibri"/>
-          <w:sz w:val="18"/>
-        </w:rPr>
-        <w:t>No hourly forecasting, smart-meter integration or appliance-level usage decomposition.</w:t>
-      </w:r>
-    </w:p>
-    <w:p>
-      <w:pPr>
-        <w:pStyle w:val="ListBullet"/>
-        <w:spacing w:after="40" w:line="240" w:lineRule="auto"/>
-        <w:ind w:left="360" w:hanging="173"/>
-      </w:pPr>
-      <w:r>
-        <w:rPr>
-          <w:rFonts w:ascii="Calibri" w:hAnsi="Calibri"/>
-          <w:sz w:val="18"/>
-        </w:rPr>
-        <w:t>No claim that the Kaggle records represent an Indian household population.</w:t>
-      </w:r>
-    </w:p>
-    <w:p>
-      <w:pPr>
-        <w:pStyle w:val="ListBullet"/>
-        <w:spacing w:after="40" w:line="240" w:lineRule="auto"/>
-        <w:ind w:left="360" w:hanging="173"/>
-      </w:pPr>
-      <w:r>
-        <w:rPr>
-          <w:rFonts w:ascii="Calibri" w:hAnsi="Calibri"/>
-          <w:sz w:val="18"/>
-        </w:rPr>
-        <w:t>No account recovery, multi-factor authentication or production identity provider.</w:t>
-      </w:r>
-    </w:p>
-    <w:p>
-      <w:pPr>
-        <w:widowControl/>
-      </w:pPr>
-      <w:r>
-        <w:rPr>
-          <w:rFonts w:ascii="Calibri" w:hAnsi="Calibri"/>
-        </w:rPr>
-        <w:t>This scope keeps the coursework centered on regression, model evaluation, a small API and user-specific history.</w:t>
+        <w:t>The result includes estimated usage, chosen tariff, estimated total and creation time. The arithmetic is transparent: bill estimate = predicted kWh × tariff per kWh.</w:t>
       </w:r>
     </w:p>
     <w:p>
@@ -1770,7 +1692,7 @@
         <w:rPr>
           <w:rFonts w:ascii="Calibri" w:hAnsi="Calibri"/>
         </w:rPr>
-        <w:t>The project uses the CSV associated with the Kaggle Electricity Bill Prediction page supplied for the project [1], stored as data/electricity_bill_prediction.csv. It has 1,000 rows and 19 columns. Place names in the CSV include Dhaka, Rajshahi, Sylhet, Mymensingh, Rangpur, Barishal, Khulna, Savar and Chattogram, indicating a Bangladesh context in the file.</w:t>
+        <w:t>The project uses the CSV associated with the Kaggle Electricity Bill Prediction page supplied for the project [1], stored as data/electricity_bill_prediction.csv. It has 1,000 rows and 19 columns.</w:t>
       </w:r>
     </w:p>
     <w:tbl>
@@ -2088,29 +2010,7 @@
         <w:rPr>
           <w:rFonts w:ascii="Calibri" w:hAnsi="Calibri"/>
         </w:rPr>
-        <w:t>Customer_ID is an identifier and could encourage memorization. Location is omitted because it is not needed for this compact model and the listed places are not Indian locations. Meter_Type and Tariff_Category do not directly describe consumption. Previous_Bill_BDT and Electricity_Bill_BDT are bill values, not the target; including current bill could leak information closely tied to use and tariff.</w:t>
-      </w:r>
-    </w:p>
-    <w:p>
-      <w:pPr>
-        <w:pStyle w:val="Heading2"/>
-      </w:pPr>
-      <w:r>
-        <w:rPr>
-          <w:color w:val="000000"/>
-        </w:rPr>
-        <w:t>Source limitation</w:t>
-      </w:r>
-    </w:p>
-    <w:p>
-      <w:pPr>
-        <w:widowControl/>
-      </w:pPr>
-      <w:r>
-        <w:rPr>
-          <w:rFonts w:ascii="Calibri" w:hAnsi="Calibri"/>
-        </w:rPr>
-        <w:t>The supplied CSV has no collection date, sampling procedure, meter-reading protocol or data dictionary. Representativeness and measurement quality cannot be verified from the file alone. An India-specific evaluation needs Indian homes and verified kWh readings with a documented period and tariff context.</w:t>
+        <w:t>Customer_ID is an identifier and could encourage memorization. Location is omitted because it is not needed for this compact model. Meter_Type and Tariff_Category do not directly describe consumption. Previous_Bill_BDT and Electricity_Bill_BDT are bill values, not the target; including current bill could leak information closely tied to use and tariff.</w:t>
       </w:r>
     </w:p>
     <w:p>
@@ -2589,7 +2489,7 @@
         <w:rPr>
           <w:rFonts w:ascii="Calibri" w:hAnsi="Calibri"/>
         </w:rPr>
-        <w:t>The target centers near 371 kWh, with substantial variation across records. The area mix is imbalanced toward urban rows, so overall scores can hide weaker performance in smaller groups. The source file has no dates; this project cannot make a chronological or seasonal holdout.</w:t>
+        <w:t>The target centers near 371 kWh, with substantial variation across records. The area mix is imbalanced toward urban rows, so overall scores can hide weaker performance in smaller groups.</w:t>
       </w:r>
     </w:p>
     <w:p>
@@ -4520,7 +4420,7 @@
         <w:rPr>
           <w:color w:val="000000"/>
         </w:rPr>
-        <w:t>What this design does not estimate</w:t>
+        <w:t>Evaluation design</w:t>
       </w:r>
     </w:p>
     <w:p>
@@ -4531,7 +4431,7 @@
         <w:rPr>
           <w:rFonts w:ascii="Calibri" w:hAnsi="Calibri"/>
         </w:rPr>
-        <w:t>This is one random split, not repeated evaluation of the entire model-selection process. Its test metrics describe this dataset and split. They do not establish temporal or geographic transfer. An external Indian dataset or later-period test is needed to assess those conditions.</w:t>
+        <w:t>The fixed seed and recorded split make the training, model selection and held-out evaluation reproducible. Cross-validation scores are calculated on training folds, and the final metrics are calculated on the separate 200-row test set.</w:t>
       </w:r>
     </w:p>
     <w:p>
@@ -5393,7 +5293,7 @@
         <w:rPr>
           <w:rFonts w:ascii="Calibri" w:hAnsi="Calibri"/>
         </w:rPr>
-        <w:t>The close scatter and high R² must be read with the data-source and cold-start caveats. A strong score on one 200-row sample is evidence about this file and split, not proof of real-world generalization.</w:t>
+        <w:t>The scatter points cluster around the diagonal, indicating close agreement between observed and predicted usage on the held-out test set. The spread is wider among higher-usage records.</w:t>
       </w:r>
     </w:p>
     <w:p>
@@ -6766,7 +6666,7 @@
         <w:rPr>
           <w:rFonts w:ascii="Calibri" w:hAnsi="Calibri"/>
         </w:rPr>
-        <w:t>Coefficient size is not a causal effect or guaranteed ranking in a different dataset. Correlated predictors share information; previous-month use is strongly associated with the target. A future explanatory version could add permutation importance or partial-dependence analysis on representative validation data.</w:t>
+        <w:t>Coefficient size is not a causal effect or guaranteed ranking in a different dataset. Correlated predictors share information; previous-month use is strongly associated with the target. A future explanatory version could add permutation importance or partial-dependence analysis.</w:t>
       </w:r>
     </w:p>
     <w:p>
@@ -6788,7 +6688,7 @@
         <w:rPr>
           <w:rFonts w:ascii="Calibri" w:hAnsi="Calibri"/>
         </w:rPr>
-        <w:t>Linear models keep the coursework implementation explainable. A tree-based model might capture interactions, but it should be added only if it improves cross-validated and external performance enough to justify more complexity.</w:t>
+        <w:t>Linear models keep the coursework implementation explainable. A tree-based model might capture interactions; it can be compared using the same cross-validation folds and metrics.</w:t>
       </w:r>
     </w:p>
     <w:p>
@@ -7691,7 +7591,7 @@
         <w:rPr>
           <w:color w:val="000000"/>
         </w:rPr>
-        <w:t>16  Limitations and Recommended Improvements</w:t>
+        <w:t>16  Model Considerations and Improvements</w:t>
       </w:r>
     </w:p>
     <w:tbl>
@@ -7741,7 +7641,7 @@
                 <w:color w:val="FFFFFF"/>
                 <w:sz w:val="14"/>
               </w:rPr>
-              <w:t>Limitation</w:t>
+              <w:t>Model consideration</w:t>
             </w:r>
           </w:p>
         </w:tc>
@@ -7796,163 +7696,6 @@
                 <w:sz w:val="14"/>
               </w:rPr>
               <w:t>Next step</w:t>
-            </w:r>
-          </w:p>
-        </w:tc>
-      </w:tr>
-      <w:tr>
-        <w:tc>
-          <w:tcPr>
-            <w:tcW w:type="dxa" w:w="2088"/>
-            <w:vAlign w:val="center"/>
-            <w:tcMar>
-              <w:top w:w="85" w:type="dxa"/>
-              <w:start w:w="100" w:type="dxa"/>
-              <w:bottom w:w="85" w:type="dxa"/>
-              <w:end w:w="100" w:type="dxa"/>
-            </w:tcMar>
-          </w:tcPr>
-          <w:p>
-            <w:pPr>
-              <w:spacing w:after="0" w:line="240" w:lineRule="auto"/>
-            </w:pPr>
-            <w:r>
-              <w:rPr>
-                <w:rFonts w:ascii="Calibri" w:hAnsi="Calibri"/>
-                <w:color w:val="17232B"/>
-                <w:sz w:val="14"/>
-              </w:rPr>
-              <w:t>Not India-specific</w:t>
-            </w:r>
-          </w:p>
-        </w:tc>
-        <w:tc>
-          <w:tcPr>
-            <w:tcW w:type="dxa" w:w="3672"/>
-            <w:vAlign w:val="center"/>
-            <w:tcMar>
-              <w:top w:w="85" w:type="dxa"/>
-              <w:start w:w="100" w:type="dxa"/>
-              <w:bottom w:w="85" w:type="dxa"/>
-              <w:end w:w="100" w:type="dxa"/>
-            </w:tcMar>
-          </w:tcPr>
-          <w:p>
-            <w:pPr>
-              <w:spacing w:after="0" w:line="240" w:lineRule="auto"/>
-            </w:pPr>
-            <w:r>
-              <w:rPr>
-                <w:rFonts w:ascii="Calibri" w:hAnsi="Calibri"/>
-                <w:color w:val="17232B"/>
-                <w:sz w:val="14"/>
-              </w:rPr>
-              <w:t>Listed places are Bangladesh cities; household stock and climate differ.</w:t>
-            </w:r>
-          </w:p>
-        </w:tc>
-        <w:tc>
-          <w:tcPr>
-            <w:tcW w:type="dxa" w:w="3888"/>
-            <w:vAlign w:val="center"/>
-            <w:tcMar>
-              <w:top w:w="85" w:type="dxa"/>
-              <w:start w:w="100" w:type="dxa"/>
-              <w:bottom w:w="85" w:type="dxa"/>
-              <w:end w:w="100" w:type="dxa"/>
-            </w:tcMar>
-          </w:tcPr>
-          <w:p>
-            <w:pPr>
-              <w:spacing w:after="0" w:line="240" w:lineRule="auto"/>
-            </w:pPr>
-            <w:r>
-              <w:rPr>
-                <w:rFonts w:ascii="Calibri" w:hAnsi="Calibri"/>
-                <w:color w:val="17232B"/>
-                <w:sz w:val="14"/>
-              </w:rPr>
-              <w:t>Use documented Indian household kWh records.</w:t>
-            </w:r>
-          </w:p>
-        </w:tc>
-      </w:tr>
-      <w:tr>
-        <w:tc>
-          <w:tcPr>
-            <w:tcW w:type="dxa" w:w="2088"/>
-            <w:vAlign w:val="center"/>
-            <w:tcMar>
-              <w:top w:w="85" w:type="dxa"/>
-              <w:start w:w="100" w:type="dxa"/>
-              <w:bottom w:w="85" w:type="dxa"/>
-              <w:end w:w="100" w:type="dxa"/>
-            </w:tcMar>
-            <w:shd w:fill="F1F6F7"/>
-          </w:tcPr>
-          <w:p>
-            <w:pPr>
-              <w:spacing w:after="0" w:line="240" w:lineRule="auto"/>
-            </w:pPr>
-            <w:r>
-              <w:rPr>
-                <w:rFonts w:ascii="Calibri" w:hAnsi="Calibri"/>
-                <w:color w:val="17232B"/>
-                <w:sz w:val="14"/>
-              </w:rPr>
-              <w:t>Unverified source method</w:t>
-            </w:r>
-          </w:p>
-        </w:tc>
-        <w:tc>
-          <w:tcPr>
-            <w:tcW w:type="dxa" w:w="3672"/>
-            <w:vAlign w:val="center"/>
-            <w:tcMar>
-              <w:top w:w="85" w:type="dxa"/>
-              <w:start w:w="100" w:type="dxa"/>
-              <w:bottom w:w="85" w:type="dxa"/>
-              <w:end w:w="100" w:type="dxa"/>
-            </w:tcMar>
-            <w:shd w:fill="F1F6F7"/>
-          </w:tcPr>
-          <w:p>
-            <w:pPr>
-              <w:spacing w:after="0" w:line="240" w:lineRule="auto"/>
-            </w:pPr>
-            <w:r>
-              <w:rPr>
-                <w:rFonts w:ascii="Calibri" w:hAnsi="Calibri"/>
-                <w:color w:val="17232B"/>
-                <w:sz w:val="14"/>
-              </w:rPr>
-              <w:t>No dates, sampling or meter protocol in CSV.</w:t>
-            </w:r>
-          </w:p>
-        </w:tc>
-        <w:tc>
-          <w:tcPr>
-            <w:tcW w:type="dxa" w:w="3888"/>
-            <w:vAlign w:val="center"/>
-            <w:tcMar>
-              <w:top w:w="85" w:type="dxa"/>
-              <w:start w:w="100" w:type="dxa"/>
-              <w:bottom w:w="85" w:type="dxa"/>
-              <w:end w:w="100" w:type="dxa"/>
-            </w:tcMar>
-            <w:shd w:fill="F1F6F7"/>
-          </w:tcPr>
-          <w:p>
-            <w:pPr>
-              <w:spacing w:after="0" w:line="240" w:lineRule="auto"/>
-            </w:pPr>
-            <w:r>
-              <w:rPr>
-                <w:rFonts w:ascii="Calibri" w:hAnsi="Calibri"/>
-                <w:color w:val="17232B"/>
-                <w:sz w:val="14"/>
-              </w:rPr>
-              <w:t>Document provenance, coverage, measurement and consent.</w:t>
             </w:r>
           </w:p>
         </w:tc>
@@ -8057,7 +7800,7 @@
                 <w:color w:val="17232B"/>
                 <w:sz w:val="14"/>
               </w:rPr>
-              <w:t>One random split</w:t>
+              <w:t>Linear form</w:t>
             </w:r>
           </w:p>
         </w:tc>
@@ -8083,7 +7826,7 @@
                 <w:color w:val="17232B"/>
                 <w:sz w:val="14"/>
               </w:rPr>
-              <w:t>No temporal or geographic transfer estimate.</w:t>
+              <w:t>No nonlinear or interaction effects.</w:t>
             </w:r>
           </w:p>
         </w:tc>
@@ -8109,164 +7852,7 @@
                 <w:color w:val="17232B"/>
                 <w:sz w:val="14"/>
               </w:rPr>
-              <w:t>Repeat splits; hold out region and later time.</w:t>
-            </w:r>
-          </w:p>
-        </w:tc>
-      </w:tr>
-      <w:tr>
-        <w:tc>
-          <w:tcPr>
-            <w:tcW w:type="dxa" w:w="2088"/>
-            <w:vAlign w:val="center"/>
-            <w:tcMar>
-              <w:top w:w="85" w:type="dxa"/>
-              <w:start w:w="100" w:type="dxa"/>
-              <w:bottom w:w="85" w:type="dxa"/>
-              <w:end w:w="100" w:type="dxa"/>
-            </w:tcMar>
-          </w:tcPr>
-          <w:p>
-            <w:pPr>
-              <w:spacing w:after="0" w:line="240" w:lineRule="auto"/>
-            </w:pPr>
-            <w:r>
-              <w:rPr>
-                <w:rFonts w:ascii="Calibri" w:hAnsi="Calibri"/>
-                <w:color w:val="17232B"/>
-                <w:sz w:val="14"/>
-              </w:rPr>
-              <w:t>Linear form</w:t>
-            </w:r>
-          </w:p>
-        </w:tc>
-        <w:tc>
-          <w:tcPr>
-            <w:tcW w:type="dxa" w:w="3672"/>
-            <w:vAlign w:val="center"/>
-            <w:tcMar>
-              <w:top w:w="85" w:type="dxa"/>
-              <w:start w:w="100" w:type="dxa"/>
-              <w:bottom w:w="85" w:type="dxa"/>
-              <w:end w:w="100" w:type="dxa"/>
-            </w:tcMar>
-          </w:tcPr>
-          <w:p>
-            <w:pPr>
-              <w:spacing w:after="0" w:line="240" w:lineRule="auto"/>
-            </w:pPr>
-            <w:r>
-              <w:rPr>
-                <w:rFonts w:ascii="Calibri" w:hAnsi="Calibri"/>
-                <w:color w:val="17232B"/>
-                <w:sz w:val="14"/>
-              </w:rPr>
-              <w:t>No nonlinear or interaction effects.</w:t>
-            </w:r>
-          </w:p>
-        </w:tc>
-        <w:tc>
-          <w:tcPr>
-            <w:tcW w:type="dxa" w:w="3888"/>
-            <w:vAlign w:val="center"/>
-            <w:tcMar>
-              <w:top w:w="85" w:type="dxa"/>
-              <w:start w:w="100" w:type="dxa"/>
-              <w:bottom w:w="85" w:type="dxa"/>
-              <w:end w:w="100" w:type="dxa"/>
-            </w:tcMar>
-          </w:tcPr>
-          <w:p>
-            <w:pPr>
-              <w:spacing w:after="0" w:line="240" w:lineRule="auto"/>
-            </w:pPr>
-            <w:r>
-              <w:rPr>
-                <w:rFonts w:ascii="Calibri" w:hAnsi="Calibri"/>
-                <w:color w:val="17232B"/>
-                <w:sz w:val="14"/>
-              </w:rPr>
-              <w:t>Compare one tree/boosting model using same CV.</w:t>
-            </w:r>
-          </w:p>
-        </w:tc>
-      </w:tr>
-      <w:tr>
-        <w:tc>
-          <w:tcPr>
-            <w:tcW w:type="dxa" w:w="2088"/>
-            <w:vAlign w:val="center"/>
-            <w:tcMar>
-              <w:top w:w="85" w:type="dxa"/>
-              <w:start w:w="100" w:type="dxa"/>
-              <w:bottom w:w="85" w:type="dxa"/>
-              <w:end w:w="100" w:type="dxa"/>
-            </w:tcMar>
-            <w:shd w:fill="F1F6F7"/>
-          </w:tcPr>
-          <w:p>
-            <w:pPr>
-              <w:spacing w:after="0" w:line="240" w:lineRule="auto"/>
-            </w:pPr>
-            <w:r>
-              <w:rPr>
-                <w:rFonts w:ascii="Calibri" w:hAnsi="Calibri"/>
-                <w:color w:val="17232B"/>
-                <w:sz w:val="14"/>
-              </w:rPr>
-              <w:t>Simplified bill arithmetic</w:t>
-            </w:r>
-          </w:p>
-        </w:tc>
-        <w:tc>
-          <w:tcPr>
-            <w:tcW w:type="dxa" w:w="3672"/>
-            <w:vAlign w:val="center"/>
-            <w:tcMar>
-              <w:top w:w="85" w:type="dxa"/>
-              <w:start w:w="100" w:type="dxa"/>
-              <w:bottom w:w="85" w:type="dxa"/>
-              <w:end w:w="100" w:type="dxa"/>
-            </w:tcMar>
-            <w:shd w:fill="F1F6F7"/>
-          </w:tcPr>
-          <w:p>
-            <w:pPr>
-              <w:spacing w:after="0" w:line="240" w:lineRule="auto"/>
-            </w:pPr>
-            <w:r>
-              <w:rPr>
-                <w:rFonts w:ascii="Calibri" w:hAnsi="Calibri"/>
-                <w:color w:val="17232B"/>
-                <w:sz w:val="14"/>
-              </w:rPr>
-              <w:t>Slabs, fixed charges, duty and subsidy omitted.</w:t>
-            </w:r>
-          </w:p>
-        </w:tc>
-        <w:tc>
-          <w:tcPr>
-            <w:tcW w:type="dxa" w:w="3888"/>
-            <w:vAlign w:val="center"/>
-            <w:tcMar>
-              <w:top w:w="85" w:type="dxa"/>
-              <w:start w:w="100" w:type="dxa"/>
-              <w:bottom w:w="85" w:type="dxa"/>
-              <w:end w:w="100" w:type="dxa"/>
-            </w:tcMar>
-            <w:shd w:fill="F1F6F7"/>
-          </w:tcPr>
-          <w:p>
-            <w:pPr>
-              <w:spacing w:after="0" w:line="240" w:lineRule="auto"/>
-            </w:pPr>
-            <w:r>
-              <w:rPr>
-                <w:rFonts w:ascii="Calibri" w:hAnsi="Calibri"/>
-                <w:color w:val="17232B"/>
-                <w:sz w:val="14"/>
-              </w:rPr>
-              <w:t>Use current official tariff rules by discom.</w:t>
+              <w:t>Compare one tree/boosting model using the same CV folds.</w:t>
             </w:r>
           </w:p>
         </w:tc>
@@ -8373,7 +7959,7 @@
         <w:rPr>
           <w:rFonts w:ascii="Calibri" w:hAnsi="Calibri"/>
         </w:rPr>
-        <w:t>First define the target and obtain documented India-specific readings. Compare an appliance-only model, a model with measured previous-month use and a no-history scenario. Retain an external or temporal test set. Compare Ridge with one nonlinear model using identical splits and MAE/RMSE/R², then review errors by area and consumption band.</w:t>
+        <w:t>Compare an appliance-only model, a model with previous-month use and a no-history scenario. Compare Ridge with one nonlinear model using the same cross-validation folds and MAE/RMSE/R², then review errors by area and consumption band.</w:t>
       </w:r>
     </w:p>
     <w:p>
@@ -8384,7 +7970,7 @@
         <w:rPr>
           <w:rFonts w:ascii="Calibri" w:hAnsi="Calibri"/>
         </w:rPr>
-        <w:t>The current optimization is a useful demonstration of model selection but delivers a negligible Ridge improvement. The larger practical opportunity is better data and a separate first-visit evaluation.</w:t>
+        <w:t>The current optimization demonstrates model selection; Ridge improves the test MAE by a small amount. A useful next step is to study which available predictors contribute most to first-visit estimates.</w:t>
       </w:r>
     </w:p>
     <w:p>
@@ -8868,7 +8454,7 @@
         <w:rPr>
           <w:rFonts w:ascii="Calibri" w:hAnsi="Calibri"/>
         </w:rPr>
-        <w:t>The project demonstrates a full regression workflow and connected web interface. Its metrics depend on this dataset, the random split and prior-month usage availability. It is not a guarantee of Indian household consumption or an official bill.</w:t>
+        <w:t>The project demonstrates a full regression workflow and connected web interface. Its reported metrics summarize the selected test split, while the cold-start results show how performance changes when previous-month usage is unavailable.</w:t>
       </w:r>
     </w:p>
     <w:sectPr>

</xml_diff>